<commit_message>
del hinweis markdowntips from lk template
</commit_message>
<xml_diff>
--- a/submission_template/text.docx
+++ b/submission_template/text.docx
@@ -4,235 +4,6 @@
   <w:body>
     <w:p>
       <w:pPr>
-        <w:autoSpaceDE w:val="0"/>
-        <w:autoSpaceDN w:val="0"/>
-        <w:adjustRightInd w:val="0"/>
-        <w:spacing w:after="0" w:line="240" w:lineRule="auto"/>
-        <w:rPr>
-          <w:rFonts w:ascii="AppleSystemUIFont" w:hAnsi="AppleSystemUIFont" w:cs="AppleSystemUIFont"/>
-          <w:kern w:val="0"/>
-          <w:sz w:val="26"/>
-          <w:szCs w:val="26"/>
-        </w:rPr>
-      </w:pPr>
-      <w:r>
-        <w:rPr>
-          <w:rFonts w:ascii="AppleSystemUIFont" w:hAnsi="AppleSystemUIFont" w:cs="AppleSystemUIFont"/>
-          <w:b/>
-          <w:bCs/>
-          <w:kern w:val="0"/>
-          <w:sz w:val="26"/>
-          <w:szCs w:val="26"/>
-        </w:rPr>
-        <w:t xml:space="preserve">**Für Hinweise zur </w:t>
-      </w:r>
-      <w:proofErr w:type="spellStart"/>
-      <w:r>
-        <w:rPr>
-          <w:rFonts w:ascii="AppleSystemUIFont" w:hAnsi="AppleSystemUIFont" w:cs="AppleSystemUIFont"/>
-          <w:b/>
-          <w:bCs/>
-          <w:kern w:val="0"/>
-          <w:sz w:val="26"/>
-          <w:szCs w:val="26"/>
-        </w:rPr>
-        <w:t>Markdownformatierung</w:t>
-      </w:r>
-      <w:r>
-        <w:rPr>
-          <w:rFonts w:ascii="AppleSystemUIFont" w:hAnsi="AppleSystemUIFont" w:cs="AppleSystemUIFont"/>
-          <w:b/>
-          <w:bCs/>
-          <w:kern w:val="0"/>
-          <w:sz w:val="26"/>
-          <w:szCs w:val="26"/>
-        </w:rPr>
-        <w:t>en</w:t>
-      </w:r>
-      <w:proofErr w:type="spellEnd"/>
-      <w:r>
-        <w:rPr>
-          <w:rFonts w:ascii="AppleSystemUIFont" w:hAnsi="AppleSystemUIFont" w:cs="AppleSystemUIFont"/>
-          <w:b/>
-          <w:bCs/>
-          <w:kern w:val="0"/>
-          <w:sz w:val="26"/>
-          <w:szCs w:val="26"/>
-        </w:rPr>
-        <w:t xml:space="preserve"> siehe "markdowntipps.md"**</w:t>
-      </w:r>
-    </w:p>
-    <w:p>
-      <w:pPr>
-        <w:autoSpaceDE w:val="0"/>
-        <w:autoSpaceDN w:val="0"/>
-        <w:adjustRightInd w:val="0"/>
-        <w:spacing w:after="0" w:line="240" w:lineRule="auto"/>
-        <w:rPr>
-          <w:rFonts w:ascii="AppleSystemUIFont" w:hAnsi="AppleSystemUIFont" w:cs="AppleSystemUIFont"/>
-          <w:kern w:val="0"/>
-          <w:sz w:val="26"/>
-          <w:szCs w:val="26"/>
-        </w:rPr>
-      </w:pPr>
-    </w:p>
-    <w:p>
-      <w:pPr>
-        <w:autoSpaceDE w:val="0"/>
-        <w:autoSpaceDN w:val="0"/>
-        <w:adjustRightInd w:val="0"/>
-        <w:spacing w:after="0" w:line="240" w:lineRule="auto"/>
-        <w:rPr>
-          <w:rFonts w:ascii="AppleSystemUIFont" w:hAnsi="AppleSystemUIFont" w:cs="AppleSystemUIFont"/>
-          <w:kern w:val="0"/>
-          <w:sz w:val="26"/>
-          <w:szCs w:val="26"/>
-        </w:rPr>
-      </w:pPr>
-      <w:r>
-        <w:rPr>
-          <w:rFonts w:ascii="AppleSystemUIFont" w:hAnsi="AppleSystemUIFont" w:cs="AppleSystemUIFont"/>
-          <w:kern w:val="0"/>
-          <w:sz w:val="26"/>
-          <w:szCs w:val="26"/>
-        </w:rPr>
-        <w:t>Pro Artikelabschnitt folgen nun Hinweise zu Inhalten sowie Beispieltexte. Bitte löschen bzw. ersetzen Sie sowohl die Hinweise als auch die Beispieltexte für Ihre Einreichung.</w:t>
-      </w:r>
-    </w:p>
-    <w:p>
-      <w:pPr>
-        <w:autoSpaceDE w:val="0"/>
-        <w:autoSpaceDN w:val="0"/>
-        <w:adjustRightInd w:val="0"/>
-        <w:spacing w:after="0" w:line="240" w:lineRule="auto"/>
-        <w:rPr>
-          <w:rFonts w:ascii="AppleSystemUIFont" w:hAnsi="AppleSystemUIFont" w:cs="AppleSystemUIFont"/>
-          <w:kern w:val="0"/>
-          <w:sz w:val="26"/>
-          <w:szCs w:val="26"/>
-        </w:rPr>
-      </w:pPr>
-    </w:p>
-    <w:p>
-      <w:pPr>
-        <w:autoSpaceDE w:val="0"/>
-        <w:autoSpaceDN w:val="0"/>
-        <w:adjustRightInd w:val="0"/>
-        <w:spacing w:after="0" w:line="240" w:lineRule="auto"/>
-        <w:rPr>
-          <w:rFonts w:ascii="AppleSystemUIFont" w:hAnsi="AppleSystemUIFont" w:cs="AppleSystemUIFont"/>
-          <w:kern w:val="0"/>
-          <w:sz w:val="26"/>
-          <w:szCs w:val="26"/>
-        </w:rPr>
-      </w:pPr>
-      <w:r>
-        <w:rPr>
-          <w:rFonts w:ascii="AppleSystemUIFont" w:hAnsi="AppleSystemUIFont" w:cs="AppleSystemUIFont"/>
-          <w:kern w:val="0"/>
-          <w:sz w:val="26"/>
-          <w:szCs w:val="26"/>
-        </w:rPr>
-        <w:t>Allgemeiner Hinweis: Alle Lehrkonzepte sollen sich zur Nachnutzung eignen und Instruktionscharakter haben. Bitte verfassen Sie Ihren Beitrag daher im Präsens. Den Reflexionsteil und einzelne Punkte der Rahmenbedingungen in der Einleitung (bspw. wann und wo das Lehrkonzept bereits durchgeführt wurde) können Sie im Perfekt darstellen.</w:t>
-      </w:r>
-    </w:p>
-    <w:p>
-      <w:pPr>
-        <w:autoSpaceDE w:val="0"/>
-        <w:autoSpaceDN w:val="0"/>
-        <w:adjustRightInd w:val="0"/>
-        <w:spacing w:after="0" w:line="240" w:lineRule="auto"/>
-        <w:rPr>
-          <w:rFonts w:ascii="AppleSystemUIFont" w:hAnsi="AppleSystemUIFont" w:cs="AppleSystemUIFont"/>
-          <w:kern w:val="0"/>
-          <w:sz w:val="26"/>
-          <w:szCs w:val="26"/>
-        </w:rPr>
-      </w:pPr>
-      <w:r>
-        <w:rPr>
-          <w:rFonts w:ascii="AppleSystemUIFont" w:hAnsi="AppleSystemUIFont" w:cs="AppleSystemUIFont"/>
-          <w:kern w:val="0"/>
-          <w:sz w:val="26"/>
-          <w:szCs w:val="26"/>
-        </w:rPr>
-        <w:t xml:space="preserve">Achten Sie insgesamt bitte darauf einfache Satzstrukturen zu nutzen, Passivkonstruktionen zu vermeiden, Fachbegriffe und Abkürzungen bei Erstnennung zu erklären und Begriffe einheitlich zu verwenden (z.B. durchgängig </w:t>
-      </w:r>
-      <w:r>
-        <w:rPr>
-          <w:rFonts w:ascii="AppleSystemUIFont" w:hAnsi="AppleSystemUIFont" w:cs="AppleSystemUIFont"/>
-          <w:kern w:val="0"/>
-          <w:sz w:val="26"/>
-          <w:szCs w:val="26"/>
-        </w:rPr>
-        <w:t>„</w:t>
-      </w:r>
-      <w:r>
-        <w:rPr>
-          <w:rFonts w:ascii="AppleSystemUIFont" w:hAnsi="AppleSystemUIFont" w:cs="AppleSystemUIFont"/>
-          <w:kern w:val="0"/>
-          <w:sz w:val="26"/>
-          <w:szCs w:val="26"/>
-        </w:rPr>
-        <w:t>Seminar</w:t>
-      </w:r>
-      <w:r>
-        <w:rPr>
-          <w:rFonts w:ascii="AppleSystemUIFont" w:hAnsi="AppleSystemUIFont" w:cs="AppleSystemUIFont"/>
-          <w:kern w:val="0"/>
-          <w:sz w:val="26"/>
-          <w:szCs w:val="26"/>
-        </w:rPr>
-        <w:t>“</w:t>
-      </w:r>
-      <w:r>
-        <w:rPr>
-          <w:rFonts w:ascii="AppleSystemUIFont" w:hAnsi="AppleSystemUIFont" w:cs="AppleSystemUIFont"/>
-          <w:kern w:val="0"/>
-          <w:sz w:val="26"/>
-          <w:szCs w:val="26"/>
-        </w:rPr>
-        <w:t xml:space="preserve"> oder </w:t>
-      </w:r>
-      <w:r>
-        <w:rPr>
-          <w:rFonts w:ascii="AppleSystemUIFont" w:hAnsi="AppleSystemUIFont" w:cs="AppleSystemUIFont"/>
-          <w:kern w:val="0"/>
-          <w:sz w:val="26"/>
-          <w:szCs w:val="26"/>
-        </w:rPr>
-        <w:t>„</w:t>
-      </w:r>
-      <w:r>
-        <w:rPr>
-          <w:rFonts w:ascii="AppleSystemUIFont" w:hAnsi="AppleSystemUIFont" w:cs="AppleSystemUIFont"/>
-          <w:kern w:val="0"/>
-          <w:sz w:val="26"/>
-          <w:szCs w:val="26"/>
-        </w:rPr>
-        <w:t>Lehrveranstaltung</w:t>
-      </w:r>
-      <w:r>
-        <w:rPr>
-          <w:rFonts w:ascii="AppleSystemUIFont" w:hAnsi="AppleSystemUIFont" w:cs="AppleSystemUIFont"/>
-          <w:kern w:val="0"/>
-          <w:sz w:val="26"/>
-          <w:szCs w:val="26"/>
-        </w:rPr>
-        <w:t>“</w:t>
-      </w:r>
-      <w:r>
-        <w:rPr>
-          <w:rFonts w:ascii="AppleSystemUIFont" w:hAnsi="AppleSystemUIFont" w:cs="AppleSystemUIFont"/>
-          <w:kern w:val="0"/>
-          <w:sz w:val="26"/>
-          <w:szCs w:val="26"/>
-        </w:rPr>
-        <w:t>).</w:t>
-      </w:r>
-    </w:p>
-    <w:p>
-      <w:pPr>
         <w:pStyle w:val="berschrift1"/>
       </w:pPr>
       <w:r>
@@ -546,7 +317,6 @@
           <w:sz w:val="26"/>
           <w:szCs w:val="26"/>
         </w:rPr>
-        <w:lastRenderedPageBreak/>
         <w:t>* Modus: Fand(en) die LV/der Workshop/die vorgestellten Sitzungen asynchron/synchron/gemischt statt?</w:t>
       </w:r>
     </w:p>
@@ -1077,7 +847,6 @@
           <w:sz w:val="26"/>
           <w:szCs w:val="26"/>
         </w:rPr>
-        <w:lastRenderedPageBreak/>
         <w:t xml:space="preserve">           </w:t>
       </w:r>
     </w:p>
@@ -1248,6 +1017,7 @@
         <w:pStyle w:val="berschrift1"/>
       </w:pPr>
       <w:r>
+        <w:lastRenderedPageBreak/>
         <w:t>4 Elemente der Lehreinheit (Passen Sie diese Überschrift ggf. gerne an)</w:t>
       </w:r>
     </w:p>
@@ -1433,87 +1203,347 @@
           <w:sz w:val="26"/>
           <w:szCs w:val="26"/>
         </w:rPr>
+        <w:t>Nennen Sie ggf. Ideen oder Lösungsvorschläge zur Überwindung der genannten Herausforderungen oder, falls Sie das Lehrkonzept mehrmals angewendet haben, welche Anpassungen Sie weshalb getätigt haben. Gehen Sie darauf ein, ob Sie bei erneuter Durchführung des Konzepts Anpassungen durchführen würden. Stellen Sie dabei einen Bezug zu Gründen oder möglichen Ursachen auf.</w:t>
+      </w:r>
+    </w:p>
+    <w:p>
+      <w:pPr>
+        <w:autoSpaceDE w:val="0"/>
+        <w:autoSpaceDN w:val="0"/>
+        <w:adjustRightInd w:val="0"/>
+        <w:spacing w:after="0" w:line="240" w:lineRule="auto"/>
+        <w:rPr>
+          <w:rFonts w:ascii="AppleSystemUIFont" w:hAnsi="AppleSystemUIFont" w:cs="AppleSystemUIFont"/>
+          <w:kern w:val="0"/>
+          <w:sz w:val="26"/>
+          <w:szCs w:val="26"/>
+        </w:rPr>
+      </w:pPr>
+      <w:r>
+        <w:rPr>
+          <w:rFonts w:ascii="AppleSystemUIFont" w:hAnsi="AppleSystemUIFont" w:cs="AppleSystemUIFont"/>
+          <w:kern w:val="0"/>
+          <w:sz w:val="26"/>
+          <w:szCs w:val="26"/>
+        </w:rPr>
+        <w:t>Gehen Sie auch gerne auf Feedback ein, das Sie im Zuge der Durchführung Ihrer Veranstaltung erhalten haben.</w:t>
+      </w:r>
+    </w:p>
+    <w:p>
+      <w:pPr>
+        <w:autoSpaceDE w:val="0"/>
+        <w:autoSpaceDN w:val="0"/>
+        <w:adjustRightInd w:val="0"/>
+        <w:spacing w:after="0" w:line="240" w:lineRule="auto"/>
+        <w:rPr>
+          <w:rFonts w:ascii="AppleSystemUIFont" w:hAnsi="AppleSystemUIFont" w:cs="AppleSystemUIFont"/>
+          <w:kern w:val="0"/>
+          <w:sz w:val="26"/>
+          <w:szCs w:val="26"/>
+        </w:rPr>
+      </w:pPr>
+      <w:r>
+        <w:rPr>
+          <w:rFonts w:ascii="AppleSystemUIFont" w:hAnsi="AppleSystemUIFont" w:cs="AppleSystemUIFont"/>
+          <w:kern w:val="0"/>
+          <w:sz w:val="26"/>
+          <w:szCs w:val="26"/>
+        </w:rPr>
+        <w:t>Es ist Ihnen freigestellt, ob Sie diesen Abschnitt in die entsprechenden Unterpunkte gliedern</w:t>
+      </w:r>
+      <w:r>
+        <w:rPr>
+          <w:rFonts w:ascii="AppleSystemUIFont" w:hAnsi="AppleSystemUIFont" w:cs="AppleSystemUIFont"/>
+          <w:kern w:val="0"/>
+          <w:sz w:val="26"/>
+          <w:szCs w:val="26"/>
+        </w:rPr>
+        <w:t>,</w:t>
+      </w:r>
+      <w:r>
+        <w:rPr>
+          <w:rFonts w:ascii="AppleSystemUIFont" w:hAnsi="AppleSystemUIFont" w:cs="AppleSystemUIFont"/>
+          <w:kern w:val="0"/>
+          <w:sz w:val="26"/>
+          <w:szCs w:val="26"/>
+        </w:rPr>
+        <w:t xml:space="preserve"> oder diese beispielweise durch entsprechende Absätze darstellen.</w:t>
+      </w:r>
+    </w:p>
+    <w:p>
+      <w:pPr>
+        <w:autoSpaceDE w:val="0"/>
+        <w:autoSpaceDN w:val="0"/>
+        <w:adjustRightInd w:val="0"/>
+        <w:spacing w:after="0" w:line="240" w:lineRule="auto"/>
+        <w:rPr>
+          <w:rFonts w:ascii="AppleSystemUIFont" w:hAnsi="AppleSystemUIFont" w:cs="AppleSystemUIFont"/>
+          <w:kern w:val="0"/>
+          <w:sz w:val="26"/>
+          <w:szCs w:val="26"/>
+        </w:rPr>
+      </w:pPr>
+    </w:p>
+    <w:p>
+      <w:pPr>
+        <w:autoSpaceDE w:val="0"/>
+        <w:autoSpaceDN w:val="0"/>
+        <w:adjustRightInd w:val="0"/>
+        <w:spacing w:after="0" w:line="240" w:lineRule="auto"/>
+        <w:rPr>
+          <w:rFonts w:ascii="AppleSystemUIFont" w:hAnsi="AppleSystemUIFont" w:cs="AppleSystemUIFont"/>
+          <w:kern w:val="0"/>
+          <w:sz w:val="26"/>
+          <w:szCs w:val="26"/>
+        </w:rPr>
+      </w:pPr>
+    </w:p>
+    <w:p>
+      <w:pPr>
+        <w:pStyle w:val="berschrift2"/>
+      </w:pPr>
+      <w:r>
         <w:lastRenderedPageBreak/>
-        <w:t>Nennen Sie ggf. Ideen oder Lösungsvorschläge zur Überwindung der genannten Herausforderungen oder, falls Sie das Lehrkonzept mehrmals angewendet haben, welche Anpassungen Sie weshalb getätigt haben. Gehen Sie darauf ein, ob Sie bei erneuter Durchführung des Konzepts Anpassungen durchführen würden. Stellen Sie dabei einen Bezug zu Gründen oder möglichen Ursachen auf.</w:t>
-      </w:r>
-    </w:p>
-    <w:p>
-      <w:pPr>
-        <w:autoSpaceDE w:val="0"/>
-        <w:autoSpaceDN w:val="0"/>
-        <w:adjustRightInd w:val="0"/>
-        <w:spacing w:after="0" w:line="240" w:lineRule="auto"/>
-        <w:rPr>
-          <w:rFonts w:ascii="AppleSystemUIFont" w:hAnsi="AppleSystemUIFont" w:cs="AppleSystemUIFont"/>
-          <w:kern w:val="0"/>
-          <w:sz w:val="26"/>
-          <w:szCs w:val="26"/>
-        </w:rPr>
-      </w:pPr>
-      <w:r>
-        <w:rPr>
-          <w:rFonts w:ascii="AppleSystemUIFont" w:hAnsi="AppleSystemUIFont" w:cs="AppleSystemUIFont"/>
-          <w:kern w:val="0"/>
-          <w:sz w:val="26"/>
-          <w:szCs w:val="26"/>
-        </w:rPr>
-        <w:t>Gehen Sie auch gerne auf Feedback ein, das Sie im Zuge der Durchführung Ihrer Veranstaltung erhalten haben.</w:t>
-      </w:r>
-    </w:p>
-    <w:p>
-      <w:pPr>
-        <w:autoSpaceDE w:val="0"/>
-        <w:autoSpaceDN w:val="0"/>
-        <w:adjustRightInd w:val="0"/>
-        <w:spacing w:after="0" w:line="240" w:lineRule="auto"/>
-        <w:rPr>
-          <w:rFonts w:ascii="AppleSystemUIFont" w:hAnsi="AppleSystemUIFont" w:cs="AppleSystemUIFont"/>
-          <w:kern w:val="0"/>
-          <w:sz w:val="26"/>
-          <w:szCs w:val="26"/>
-        </w:rPr>
-      </w:pPr>
-      <w:r>
-        <w:rPr>
-          <w:rFonts w:ascii="AppleSystemUIFont" w:hAnsi="AppleSystemUIFont" w:cs="AppleSystemUIFont"/>
-          <w:kern w:val="0"/>
-          <w:sz w:val="26"/>
-          <w:szCs w:val="26"/>
-        </w:rPr>
-        <w:t>Es ist Ihnen freigestellt, ob Sie diesen Abschnitt in die entsprechenden Unterpunkte gliedern</w:t>
-      </w:r>
-      <w:r>
-        <w:rPr>
-          <w:rFonts w:ascii="AppleSystemUIFont" w:hAnsi="AppleSystemUIFont" w:cs="AppleSystemUIFont"/>
-          <w:kern w:val="0"/>
-          <w:sz w:val="26"/>
-          <w:szCs w:val="26"/>
-        </w:rPr>
-        <w:t>,</w:t>
-      </w:r>
-      <w:r>
-        <w:rPr>
-          <w:rFonts w:ascii="AppleSystemUIFont" w:hAnsi="AppleSystemUIFont" w:cs="AppleSystemUIFont"/>
-          <w:kern w:val="0"/>
-          <w:sz w:val="26"/>
-          <w:szCs w:val="26"/>
-        </w:rPr>
-        <w:t xml:space="preserve"> oder diese beispielweise durch entsprechende Absätze darstellen.</w:t>
-      </w:r>
-    </w:p>
-    <w:p>
-      <w:pPr>
-        <w:autoSpaceDE w:val="0"/>
-        <w:autoSpaceDN w:val="0"/>
-        <w:adjustRightInd w:val="0"/>
-        <w:spacing w:after="0" w:line="240" w:lineRule="auto"/>
-        <w:rPr>
-          <w:rFonts w:ascii="AppleSystemUIFont" w:hAnsi="AppleSystemUIFont" w:cs="AppleSystemUIFont"/>
-          <w:kern w:val="0"/>
-          <w:sz w:val="26"/>
-          <w:szCs w:val="26"/>
-        </w:rPr>
-      </w:pPr>
+        <w:t>5.1 Rahmenbedingungen &amp; Ausführung</w:t>
+      </w:r>
+    </w:p>
+    <w:p>
+      <w:pPr>
+        <w:autoSpaceDE w:val="0"/>
+        <w:autoSpaceDN w:val="0"/>
+        <w:adjustRightInd w:val="0"/>
+        <w:spacing w:after="0" w:line="240" w:lineRule="auto"/>
+        <w:rPr>
+          <w:rFonts w:ascii="AppleSystemUIFont" w:hAnsi="AppleSystemUIFont" w:cs="AppleSystemUIFont"/>
+          <w:kern w:val="0"/>
+          <w:sz w:val="26"/>
+          <w:szCs w:val="26"/>
+        </w:rPr>
+      </w:pPr>
+    </w:p>
+    <w:p>
+      <w:pPr>
+        <w:autoSpaceDE w:val="0"/>
+        <w:autoSpaceDN w:val="0"/>
+        <w:adjustRightInd w:val="0"/>
+        <w:spacing w:after="0" w:line="240" w:lineRule="auto"/>
+        <w:rPr>
+          <w:rFonts w:ascii="AppleSystemUIFont" w:hAnsi="AppleSystemUIFont" w:cs="AppleSystemUIFont"/>
+          <w:kern w:val="0"/>
+          <w:sz w:val="26"/>
+          <w:szCs w:val="26"/>
+        </w:rPr>
+      </w:pPr>
+      <w:r>
+        <w:rPr>
+          <w:rFonts w:ascii="AppleSystemUIFont" w:hAnsi="AppleSystemUIFont" w:cs="AppleSystemUIFont"/>
+          <w:kern w:val="0"/>
+          <w:sz w:val="26"/>
+          <w:szCs w:val="26"/>
+        </w:rPr>
+        <w:t>* War der Veranstaltungstyp (Übung, (Pro)Seminar etc.) in Bezug auf das Lernziel angemessen?</w:t>
+      </w:r>
+    </w:p>
+    <w:p>
+      <w:pPr>
+        <w:autoSpaceDE w:val="0"/>
+        <w:autoSpaceDN w:val="0"/>
+        <w:adjustRightInd w:val="0"/>
+        <w:spacing w:after="0" w:line="240" w:lineRule="auto"/>
+        <w:rPr>
+          <w:rFonts w:ascii="AppleSystemUIFont" w:hAnsi="AppleSystemUIFont" w:cs="AppleSystemUIFont"/>
+          <w:kern w:val="0"/>
+          <w:sz w:val="26"/>
+          <w:szCs w:val="26"/>
+        </w:rPr>
+      </w:pPr>
+      <w:r>
+        <w:rPr>
+          <w:rFonts w:ascii="AppleSystemUIFont" w:hAnsi="AppleSystemUIFont" w:cs="AppleSystemUIFont"/>
+          <w:kern w:val="0"/>
+          <w:sz w:val="26"/>
+          <w:szCs w:val="26"/>
+        </w:rPr>
+        <w:t>* Umfang und Inhalt: Hat die geplante Durchführung der tatsächlichen Durchführung entsprochen? Zu welchen Änderungen/Anpassungen kam es und was waren die Ursachen?</w:t>
+      </w:r>
+    </w:p>
+    <w:p>
+      <w:pPr>
+        <w:autoSpaceDE w:val="0"/>
+        <w:autoSpaceDN w:val="0"/>
+        <w:adjustRightInd w:val="0"/>
+        <w:spacing w:after="0" w:line="240" w:lineRule="auto"/>
+        <w:rPr>
+          <w:rFonts w:ascii="AppleSystemUIFont" w:hAnsi="AppleSystemUIFont" w:cs="AppleSystemUIFont"/>
+          <w:kern w:val="0"/>
+          <w:sz w:val="26"/>
+          <w:szCs w:val="26"/>
+        </w:rPr>
+      </w:pPr>
+      <w:r>
+        <w:rPr>
+          <w:rFonts w:ascii="AppleSystemUIFont" w:hAnsi="AppleSystemUIFont" w:cs="AppleSystemUIFont"/>
+          <w:kern w:val="0"/>
+          <w:sz w:val="26"/>
+          <w:szCs w:val="26"/>
+        </w:rPr>
+        <w:t xml:space="preserve">* </w:t>
+      </w:r>
+      <w:proofErr w:type="spellStart"/>
+      <w:r>
+        <w:rPr>
+          <w:rFonts w:ascii="AppleSystemUIFont" w:hAnsi="AppleSystemUIFont" w:cs="AppleSystemUIFont"/>
+          <w:kern w:val="0"/>
+          <w:sz w:val="26"/>
+          <w:szCs w:val="26"/>
+        </w:rPr>
+        <w:t>Blended</w:t>
+      </w:r>
+      <w:proofErr w:type="spellEnd"/>
+      <w:r>
+        <w:rPr>
+          <w:rFonts w:ascii="AppleSystemUIFont" w:hAnsi="AppleSystemUIFont" w:cs="AppleSystemUIFont"/>
+          <w:kern w:val="0"/>
+          <w:sz w:val="26"/>
+          <w:szCs w:val="26"/>
+        </w:rPr>
+        <w:t xml:space="preserve"> Learning: War die Mischung von synchron und asynchronen Elementen sinnvoll? Ggf. Hätte sich die Mischung von synchronen und asynchronen Sitzungen angeboten? </w:t>
+      </w:r>
+    </w:p>
+    <w:p>
+      <w:pPr>
+        <w:autoSpaceDE w:val="0"/>
+        <w:autoSpaceDN w:val="0"/>
+        <w:adjustRightInd w:val="0"/>
+        <w:spacing w:after="0" w:line="240" w:lineRule="auto"/>
+        <w:rPr>
+          <w:rFonts w:ascii="AppleSystemUIFont" w:hAnsi="AppleSystemUIFont" w:cs="AppleSystemUIFont"/>
+          <w:kern w:val="0"/>
+          <w:sz w:val="26"/>
+          <w:szCs w:val="26"/>
+        </w:rPr>
+      </w:pPr>
+      <w:r>
+        <w:rPr>
+          <w:rFonts w:ascii="AppleSystemUIFont" w:hAnsi="AppleSystemUIFont" w:cs="AppleSystemUIFont"/>
+          <w:kern w:val="0"/>
+          <w:sz w:val="26"/>
+          <w:szCs w:val="26"/>
+        </w:rPr>
+        <w:t>* Verfügbarkeit von Medien und Materialien: Waren Medien und Materialien (</w:t>
+      </w:r>
+      <w:proofErr w:type="spellStart"/>
+      <w:r>
+        <w:rPr>
+          <w:rFonts w:ascii="AppleSystemUIFont" w:hAnsi="AppleSystemUIFont" w:cs="AppleSystemUIFont"/>
+          <w:kern w:val="0"/>
+          <w:sz w:val="26"/>
+          <w:szCs w:val="26"/>
+        </w:rPr>
+        <w:t>Beamer</w:t>
+      </w:r>
+      <w:proofErr w:type="spellEnd"/>
+      <w:r>
+        <w:rPr>
+          <w:rFonts w:ascii="AppleSystemUIFont" w:hAnsi="AppleSystemUIFont" w:cs="AppleSystemUIFont"/>
+          <w:kern w:val="0"/>
+          <w:sz w:val="26"/>
+          <w:szCs w:val="26"/>
+        </w:rPr>
+        <w:t>, Smartboard, Online-Meetings, WLAN) verfügbar und notwendig?</w:t>
+      </w:r>
+    </w:p>
+    <w:p>
+      <w:pPr>
+        <w:autoSpaceDE w:val="0"/>
+        <w:autoSpaceDN w:val="0"/>
+        <w:adjustRightInd w:val="0"/>
+        <w:spacing w:after="0" w:line="240" w:lineRule="auto"/>
+        <w:rPr>
+          <w:rFonts w:ascii="AppleSystemUIFont" w:hAnsi="AppleSystemUIFont" w:cs="AppleSystemUIFont"/>
+          <w:kern w:val="0"/>
+          <w:sz w:val="26"/>
+          <w:szCs w:val="26"/>
+        </w:rPr>
+      </w:pPr>
+      <w:r>
+        <w:rPr>
+          <w:rFonts w:ascii="AppleSystemUIFont" w:hAnsi="AppleSystemUIFont" w:cs="AppleSystemUIFont"/>
+          <w:kern w:val="0"/>
+          <w:sz w:val="26"/>
+          <w:szCs w:val="26"/>
+        </w:rPr>
+        <w:t>* Materialzugänglichkeit (Bücher, Online-Materialien, Geräte, Ausstattung)</w:t>
+      </w:r>
+    </w:p>
+    <w:p>
+      <w:pPr>
+        <w:autoSpaceDE w:val="0"/>
+        <w:autoSpaceDN w:val="0"/>
+        <w:adjustRightInd w:val="0"/>
+        <w:spacing w:after="0" w:line="240" w:lineRule="auto"/>
+        <w:rPr>
+          <w:rFonts w:ascii="AppleSystemUIFont" w:hAnsi="AppleSystemUIFont" w:cs="AppleSystemUIFont"/>
+          <w:kern w:val="0"/>
+          <w:sz w:val="26"/>
+          <w:szCs w:val="26"/>
+        </w:rPr>
+      </w:pPr>
+      <w:r>
+        <w:rPr>
+          <w:rFonts w:ascii="AppleSystemUIFont" w:hAnsi="AppleSystemUIFont" w:cs="AppleSystemUIFont"/>
+          <w:kern w:val="0"/>
+          <w:sz w:val="26"/>
+          <w:szCs w:val="26"/>
+        </w:rPr>
+        <w:t>* Tutor\*innen: War die Unterstützung von Tutor*innen sinnvoll? Oder wäre die Unterstützung im Rückblick sinnvoll?</w:t>
+      </w:r>
+    </w:p>
+    <w:p>
+      <w:pPr>
+        <w:autoSpaceDE w:val="0"/>
+        <w:autoSpaceDN w:val="0"/>
+        <w:adjustRightInd w:val="0"/>
+        <w:spacing w:after="0" w:line="240" w:lineRule="auto"/>
+        <w:rPr>
+          <w:rFonts w:ascii="AppleSystemUIFont" w:hAnsi="AppleSystemUIFont" w:cs="AppleSystemUIFont"/>
+          <w:kern w:val="0"/>
+          <w:sz w:val="26"/>
+          <w:szCs w:val="26"/>
+        </w:rPr>
+      </w:pPr>
+      <w:r>
+        <w:rPr>
+          <w:rFonts w:ascii="AppleSystemUIFont" w:hAnsi="AppleSystemUIFont" w:cs="AppleSystemUIFont"/>
+          <w:kern w:val="0"/>
+          <w:sz w:val="26"/>
+          <w:szCs w:val="26"/>
+        </w:rPr>
+        <w:t>* Wie haben sich die Frequenz und der Umfang der Vorbereitungen/Aufgaben/Abgaben bewährt?</w:t>
+      </w:r>
+    </w:p>
+    <w:p>
+      <w:pPr>
+        <w:autoSpaceDE w:val="0"/>
+        <w:autoSpaceDN w:val="0"/>
+        <w:adjustRightInd w:val="0"/>
+        <w:spacing w:after="0" w:line="240" w:lineRule="auto"/>
+        <w:rPr>
+          <w:rFonts w:ascii="AppleSystemUIFont" w:hAnsi="AppleSystemUIFont" w:cs="AppleSystemUIFont"/>
+          <w:kern w:val="0"/>
+          <w:sz w:val="26"/>
+          <w:szCs w:val="26"/>
+        </w:rPr>
+      </w:pPr>
+      <w:r>
+        <w:rPr>
+          <w:rFonts w:ascii="AppleSystemUIFont" w:hAnsi="AppleSystemUIFont" w:cs="AppleSystemUIFont"/>
+          <w:kern w:val="0"/>
+          <w:sz w:val="26"/>
+          <w:szCs w:val="26"/>
+        </w:rPr>
+        <w:t>* Hat sich die Prüfungsform als sinnvoll erwiesen?</w:t>
+      </w:r>
     </w:p>
     <w:p>
       <w:pPr>
@@ -1534,90 +1564,44 @@
         <w:pStyle w:val="berschrift2"/>
       </w:pPr>
       <w:r>
-        <w:t>5.1 Rahmenbedingungen &amp; Ausführung</w:t>
-      </w:r>
-    </w:p>
-    <w:p>
-      <w:pPr>
-        <w:autoSpaceDE w:val="0"/>
-        <w:autoSpaceDN w:val="0"/>
-        <w:adjustRightInd w:val="0"/>
-        <w:spacing w:after="0" w:line="240" w:lineRule="auto"/>
-        <w:rPr>
-          <w:rFonts w:ascii="AppleSystemUIFont" w:hAnsi="AppleSystemUIFont" w:cs="AppleSystemUIFont"/>
-          <w:kern w:val="0"/>
-          <w:sz w:val="26"/>
-          <w:szCs w:val="26"/>
-        </w:rPr>
-      </w:pPr>
-    </w:p>
-    <w:p>
-      <w:pPr>
-        <w:autoSpaceDE w:val="0"/>
-        <w:autoSpaceDN w:val="0"/>
-        <w:adjustRightInd w:val="0"/>
-        <w:spacing w:after="0" w:line="240" w:lineRule="auto"/>
-        <w:rPr>
-          <w:rFonts w:ascii="AppleSystemUIFont" w:hAnsi="AppleSystemUIFont" w:cs="AppleSystemUIFont"/>
-          <w:kern w:val="0"/>
-          <w:sz w:val="26"/>
-          <w:szCs w:val="26"/>
-        </w:rPr>
-      </w:pPr>
-      <w:r>
-        <w:rPr>
-          <w:rFonts w:ascii="AppleSystemUIFont" w:hAnsi="AppleSystemUIFont" w:cs="AppleSystemUIFont"/>
-          <w:kern w:val="0"/>
-          <w:sz w:val="26"/>
-          <w:szCs w:val="26"/>
-        </w:rPr>
-        <w:t>* War der Veranstaltungstyp (Übung, (Pro)Seminar etc.) in Bezug auf das Lernziel angemessen?</w:t>
-      </w:r>
-    </w:p>
-    <w:p>
-      <w:pPr>
-        <w:autoSpaceDE w:val="0"/>
-        <w:autoSpaceDN w:val="0"/>
-        <w:adjustRightInd w:val="0"/>
-        <w:spacing w:after="0" w:line="240" w:lineRule="auto"/>
-        <w:rPr>
-          <w:rFonts w:ascii="AppleSystemUIFont" w:hAnsi="AppleSystemUIFont" w:cs="AppleSystemUIFont"/>
-          <w:kern w:val="0"/>
-          <w:sz w:val="26"/>
-          <w:szCs w:val="26"/>
-        </w:rPr>
-      </w:pPr>
-      <w:r>
-        <w:rPr>
-          <w:rFonts w:ascii="AppleSystemUIFont" w:hAnsi="AppleSystemUIFont" w:cs="AppleSystemUIFont"/>
-          <w:kern w:val="0"/>
-          <w:sz w:val="26"/>
-          <w:szCs w:val="26"/>
-        </w:rPr>
-        <w:t>* Umfang und Inhalt: Hat die geplante Durchführung der tatsächlichen Durchführung entsprochen? Zu welchen Änderungen/Anpassungen kam es und was waren die Ursachen?</w:t>
-      </w:r>
-    </w:p>
-    <w:p>
-      <w:pPr>
-        <w:autoSpaceDE w:val="0"/>
-        <w:autoSpaceDN w:val="0"/>
-        <w:adjustRightInd w:val="0"/>
-        <w:spacing w:after="0" w:line="240" w:lineRule="auto"/>
-        <w:rPr>
-          <w:rFonts w:ascii="AppleSystemUIFont" w:hAnsi="AppleSystemUIFont" w:cs="AppleSystemUIFont"/>
-          <w:kern w:val="0"/>
-          <w:sz w:val="26"/>
-          <w:szCs w:val="26"/>
-        </w:rPr>
-      </w:pPr>
-      <w:r>
-        <w:rPr>
-          <w:rFonts w:ascii="AppleSystemUIFont" w:hAnsi="AppleSystemUIFont" w:cs="AppleSystemUIFont"/>
-          <w:kern w:val="0"/>
-          <w:sz w:val="26"/>
-          <w:szCs w:val="26"/>
-        </w:rPr>
-        <w:t xml:space="preserve">* </w:t>
+        <w:t>5.2 Studierende</w:t>
+      </w:r>
+    </w:p>
+    <w:p>
+      <w:pPr>
+        <w:autoSpaceDE w:val="0"/>
+        <w:autoSpaceDN w:val="0"/>
+        <w:adjustRightInd w:val="0"/>
+        <w:spacing w:after="0" w:line="240" w:lineRule="auto"/>
+        <w:rPr>
+          <w:rFonts w:ascii="AppleSystemUIFont" w:hAnsi="AppleSystemUIFont" w:cs="AppleSystemUIFont"/>
+          <w:kern w:val="0"/>
+          <w:sz w:val="26"/>
+          <w:szCs w:val="26"/>
+        </w:rPr>
+      </w:pPr>
+    </w:p>
+    <w:p>
+      <w:pPr>
+        <w:autoSpaceDE w:val="0"/>
+        <w:autoSpaceDN w:val="0"/>
+        <w:adjustRightInd w:val="0"/>
+        <w:spacing w:after="0" w:line="240" w:lineRule="auto"/>
+        <w:rPr>
+          <w:rFonts w:ascii="AppleSystemUIFont" w:hAnsi="AppleSystemUIFont" w:cs="AppleSystemUIFont"/>
+          <w:kern w:val="0"/>
+          <w:sz w:val="26"/>
+          <w:szCs w:val="26"/>
+        </w:rPr>
+      </w:pPr>
+      <w:r>
+        <w:rPr>
+          <w:rFonts w:ascii="AppleSystemUIFont" w:hAnsi="AppleSystemUIFont" w:cs="AppleSystemUIFont"/>
+          <w:kern w:val="0"/>
+          <w:sz w:val="26"/>
+          <w:szCs w:val="26"/>
+        </w:rPr>
+        <w:t xml:space="preserve">* Zielgruppe: Studierende welcher Fachrichtungen und welches angestrebten Hochschulgrades (Bachelor/Master) haben tatsächlich ihre Veranstaltung besucht? Zu welchen Anpassungen führte die </w:t>
       </w:r>
       <w:proofErr w:type="spellStart"/>
       <w:r>
@@ -1627,7 +1611,7 @@
           <w:sz w:val="26"/>
           <w:szCs w:val="26"/>
         </w:rPr>
-        <w:t>Blended</w:t>
+        <w:t>möglw</w:t>
       </w:r>
       <w:proofErr w:type="spellEnd"/>
       <w:r>
@@ -1637,220 +1621,6 @@
           <w:sz w:val="26"/>
           <w:szCs w:val="26"/>
         </w:rPr>
-        <w:t xml:space="preserve"> Learning: War die Mischung von synchron und asynchronen Elementen sinnvoll? Ggf. Hätte sich die Mischung von synchronen und asynchronen Sitzungen angeboten? </w:t>
-      </w:r>
-    </w:p>
-    <w:p>
-      <w:pPr>
-        <w:autoSpaceDE w:val="0"/>
-        <w:autoSpaceDN w:val="0"/>
-        <w:adjustRightInd w:val="0"/>
-        <w:spacing w:after="0" w:line="240" w:lineRule="auto"/>
-        <w:rPr>
-          <w:rFonts w:ascii="AppleSystemUIFont" w:hAnsi="AppleSystemUIFont" w:cs="AppleSystemUIFont"/>
-          <w:kern w:val="0"/>
-          <w:sz w:val="26"/>
-          <w:szCs w:val="26"/>
-        </w:rPr>
-      </w:pPr>
-      <w:r>
-        <w:rPr>
-          <w:rFonts w:ascii="AppleSystemUIFont" w:hAnsi="AppleSystemUIFont" w:cs="AppleSystemUIFont"/>
-          <w:kern w:val="0"/>
-          <w:sz w:val="26"/>
-          <w:szCs w:val="26"/>
-        </w:rPr>
-        <w:t>* Verfügbarkeit von Medien und Materialien: Waren Medien und Materialien (</w:t>
-      </w:r>
-      <w:proofErr w:type="spellStart"/>
-      <w:r>
-        <w:rPr>
-          <w:rFonts w:ascii="AppleSystemUIFont" w:hAnsi="AppleSystemUIFont" w:cs="AppleSystemUIFont"/>
-          <w:kern w:val="0"/>
-          <w:sz w:val="26"/>
-          <w:szCs w:val="26"/>
-        </w:rPr>
-        <w:t>Beamer</w:t>
-      </w:r>
-      <w:proofErr w:type="spellEnd"/>
-      <w:r>
-        <w:rPr>
-          <w:rFonts w:ascii="AppleSystemUIFont" w:hAnsi="AppleSystemUIFont" w:cs="AppleSystemUIFont"/>
-          <w:kern w:val="0"/>
-          <w:sz w:val="26"/>
-          <w:szCs w:val="26"/>
-        </w:rPr>
-        <w:t>, Smartboard, Online-Meetings, WLAN) verfügbar und notwendig?</w:t>
-      </w:r>
-    </w:p>
-    <w:p>
-      <w:pPr>
-        <w:autoSpaceDE w:val="0"/>
-        <w:autoSpaceDN w:val="0"/>
-        <w:adjustRightInd w:val="0"/>
-        <w:spacing w:after="0" w:line="240" w:lineRule="auto"/>
-        <w:rPr>
-          <w:rFonts w:ascii="AppleSystemUIFont" w:hAnsi="AppleSystemUIFont" w:cs="AppleSystemUIFont"/>
-          <w:kern w:val="0"/>
-          <w:sz w:val="26"/>
-          <w:szCs w:val="26"/>
-        </w:rPr>
-      </w:pPr>
-      <w:r>
-        <w:rPr>
-          <w:rFonts w:ascii="AppleSystemUIFont" w:hAnsi="AppleSystemUIFont" w:cs="AppleSystemUIFont"/>
-          <w:kern w:val="0"/>
-          <w:sz w:val="26"/>
-          <w:szCs w:val="26"/>
-        </w:rPr>
-        <w:t>* Materialzugänglichkeit (Bücher, Online-Materialien, Geräte, Ausstattung)</w:t>
-      </w:r>
-    </w:p>
-    <w:p>
-      <w:pPr>
-        <w:autoSpaceDE w:val="0"/>
-        <w:autoSpaceDN w:val="0"/>
-        <w:adjustRightInd w:val="0"/>
-        <w:spacing w:after="0" w:line="240" w:lineRule="auto"/>
-        <w:rPr>
-          <w:rFonts w:ascii="AppleSystemUIFont" w:hAnsi="AppleSystemUIFont" w:cs="AppleSystemUIFont"/>
-          <w:kern w:val="0"/>
-          <w:sz w:val="26"/>
-          <w:szCs w:val="26"/>
-        </w:rPr>
-      </w:pPr>
-      <w:r>
-        <w:rPr>
-          <w:rFonts w:ascii="AppleSystemUIFont" w:hAnsi="AppleSystemUIFont" w:cs="AppleSystemUIFont"/>
-          <w:kern w:val="0"/>
-          <w:sz w:val="26"/>
-          <w:szCs w:val="26"/>
-        </w:rPr>
-        <w:t>* Tutor\*innen: War die Unterstützung von Tutor*innen sinnvoll? Oder wäre die Unterstützung im Rückblick sinnvoll?</w:t>
-      </w:r>
-    </w:p>
-    <w:p>
-      <w:pPr>
-        <w:autoSpaceDE w:val="0"/>
-        <w:autoSpaceDN w:val="0"/>
-        <w:adjustRightInd w:val="0"/>
-        <w:spacing w:after="0" w:line="240" w:lineRule="auto"/>
-        <w:rPr>
-          <w:rFonts w:ascii="AppleSystemUIFont" w:hAnsi="AppleSystemUIFont" w:cs="AppleSystemUIFont"/>
-          <w:kern w:val="0"/>
-          <w:sz w:val="26"/>
-          <w:szCs w:val="26"/>
-        </w:rPr>
-      </w:pPr>
-      <w:r>
-        <w:rPr>
-          <w:rFonts w:ascii="AppleSystemUIFont" w:hAnsi="AppleSystemUIFont" w:cs="AppleSystemUIFont"/>
-          <w:kern w:val="0"/>
-          <w:sz w:val="26"/>
-          <w:szCs w:val="26"/>
-        </w:rPr>
-        <w:t>* Wie haben sich die Frequenz und der Umfang der Vorbereitungen/Aufgaben/Abgaben bewährt?</w:t>
-      </w:r>
-    </w:p>
-    <w:p>
-      <w:pPr>
-        <w:autoSpaceDE w:val="0"/>
-        <w:autoSpaceDN w:val="0"/>
-        <w:adjustRightInd w:val="0"/>
-        <w:spacing w:after="0" w:line="240" w:lineRule="auto"/>
-        <w:rPr>
-          <w:rFonts w:ascii="AppleSystemUIFont" w:hAnsi="AppleSystemUIFont" w:cs="AppleSystemUIFont"/>
-          <w:kern w:val="0"/>
-          <w:sz w:val="26"/>
-          <w:szCs w:val="26"/>
-        </w:rPr>
-      </w:pPr>
-      <w:r>
-        <w:rPr>
-          <w:rFonts w:ascii="AppleSystemUIFont" w:hAnsi="AppleSystemUIFont" w:cs="AppleSystemUIFont"/>
-          <w:kern w:val="0"/>
-          <w:sz w:val="26"/>
-          <w:szCs w:val="26"/>
-        </w:rPr>
-        <w:t>* Hat sich die Prüfungsform als sinnvoll erwiesen?</w:t>
-      </w:r>
-    </w:p>
-    <w:p>
-      <w:pPr>
-        <w:autoSpaceDE w:val="0"/>
-        <w:autoSpaceDN w:val="0"/>
-        <w:adjustRightInd w:val="0"/>
-        <w:spacing w:after="0" w:line="240" w:lineRule="auto"/>
-        <w:rPr>
-          <w:rFonts w:ascii="AppleSystemUIFont" w:hAnsi="AppleSystemUIFont" w:cs="AppleSystemUIFont"/>
-          <w:kern w:val="0"/>
-          <w:sz w:val="26"/>
-          <w:szCs w:val="26"/>
-        </w:rPr>
-      </w:pPr>
-    </w:p>
-    <w:p>
-      <w:pPr>
-        <w:pStyle w:val="berschrift2"/>
-      </w:pPr>
-      <w:r>
-        <w:t>5.2 Studierende</w:t>
-      </w:r>
-    </w:p>
-    <w:p>
-      <w:pPr>
-        <w:autoSpaceDE w:val="0"/>
-        <w:autoSpaceDN w:val="0"/>
-        <w:adjustRightInd w:val="0"/>
-        <w:spacing w:after="0" w:line="240" w:lineRule="auto"/>
-        <w:rPr>
-          <w:rFonts w:ascii="AppleSystemUIFont" w:hAnsi="AppleSystemUIFont" w:cs="AppleSystemUIFont"/>
-          <w:kern w:val="0"/>
-          <w:sz w:val="26"/>
-          <w:szCs w:val="26"/>
-        </w:rPr>
-      </w:pPr>
-    </w:p>
-    <w:p>
-      <w:pPr>
-        <w:autoSpaceDE w:val="0"/>
-        <w:autoSpaceDN w:val="0"/>
-        <w:adjustRightInd w:val="0"/>
-        <w:spacing w:after="0" w:line="240" w:lineRule="auto"/>
-        <w:rPr>
-          <w:rFonts w:ascii="AppleSystemUIFont" w:hAnsi="AppleSystemUIFont" w:cs="AppleSystemUIFont"/>
-          <w:kern w:val="0"/>
-          <w:sz w:val="26"/>
-          <w:szCs w:val="26"/>
-        </w:rPr>
-      </w:pPr>
-      <w:r>
-        <w:rPr>
-          <w:rFonts w:ascii="AppleSystemUIFont" w:hAnsi="AppleSystemUIFont" w:cs="AppleSystemUIFont"/>
-          <w:kern w:val="0"/>
-          <w:sz w:val="26"/>
-          <w:szCs w:val="26"/>
-        </w:rPr>
-        <w:t xml:space="preserve">* Zielgruppe: Studierende welcher Fachrichtungen und welches angestrebten Hochschulgrades (Bachelor/Master) haben tatsächlich ihre Veranstaltung besucht? Zu welchen Anpassungen führte die </w:t>
-      </w:r>
-      <w:proofErr w:type="spellStart"/>
-      <w:r>
-        <w:rPr>
-          <w:rFonts w:ascii="AppleSystemUIFont" w:hAnsi="AppleSystemUIFont" w:cs="AppleSystemUIFont"/>
-          <w:kern w:val="0"/>
-          <w:sz w:val="26"/>
-          <w:szCs w:val="26"/>
-        </w:rPr>
-        <w:t>möglw</w:t>
-      </w:r>
-      <w:proofErr w:type="spellEnd"/>
-      <w:r>
-        <w:rPr>
-          <w:rFonts w:ascii="AppleSystemUIFont" w:hAnsi="AppleSystemUIFont" w:cs="AppleSystemUIFont"/>
-          <w:kern w:val="0"/>
-          <w:sz w:val="26"/>
-          <w:szCs w:val="26"/>
-        </w:rPr>
         <w:t>. von der Planung abweichende Zielgruppe?</w:t>
       </w:r>
     </w:p>
@@ -1897,7 +1667,6 @@
           <w:sz w:val="26"/>
           <w:szCs w:val="26"/>
         </w:rPr>
-        <w:lastRenderedPageBreak/>
         <w:t>* Haben Sich überfachliche Kompetenzen als hilfreich erwiesen? (z.B. Projektarbeitserfahrung, Sprachkenntnisse, interkulturelle Erfahrung)</w:t>
       </w:r>
     </w:p>

</xml_diff>